<commit_message>
Iteratioin 1 of the forearm, bicep and chest pad Flex PCBs
</commit_message>
<xml_diff>
--- a/Body-Pad Pressure Flex PCB documentation.docx
+++ b/Body-Pad Pressure Flex PCB documentation.docx
@@ -3514,12 +3514,67 @@
             <w:r>
               <w:t>Chest</w:t>
             </w:r>
+            <w:r>
+              <w:t xml:space="preserve"> (right)</w:t>
+            </w:r>
           </w:p>
         </w:tc>
         <w:tc>
           <w:tcPr>
             <w:tcW w:w="5242" w:type="dxa"/>
           </w:tcPr>
+          <w:p>
+            <w:r>
+              <w:drawing>
+                <wp:inline distT="0" distB="0" distL="0" distR="0" wp14:anchorId="5E407295" wp14:editId="75A224EF">
+                  <wp:extent cx="2876251" cy="1557943"/>
+                  <wp:effectExtent l="0" t="0" r="635" b="4445"/>
+                  <wp:docPr id="452499190" name="Picture 9"/>
+                  <wp:cNvGraphicFramePr>
+                    <a:graphicFrameLocks xmlns:a="http://schemas.openxmlformats.org/drawingml/2006/main" noChangeAspect="1"/>
+                  </wp:cNvGraphicFramePr>
+                  <a:graphic xmlns:a="http://schemas.openxmlformats.org/drawingml/2006/main">
+                    <a:graphicData uri="http://schemas.openxmlformats.org/drawingml/2006/picture">
+                      <pic:pic xmlns:pic="http://schemas.openxmlformats.org/drawingml/2006/picture">
+                        <pic:nvPicPr>
+                          <pic:cNvPr id="0" name="Picture 29"/>
+                          <pic:cNvPicPr>
+                            <a:picLocks noChangeAspect="1" noChangeArrowheads="1"/>
+                          </pic:cNvPicPr>
+                        </pic:nvPicPr>
+                        <pic:blipFill>
+                          <a:blip r:embed="rId23" cstate="print">
+                            <a:extLst>
+                              <a:ext uri="{28A0092B-C50C-407E-A947-70E740481C1C}">
+                                <a14:useLocalDpi xmlns:a14="http://schemas.microsoft.com/office/drawing/2010/main" val="0"/>
+                              </a:ext>
+                            </a:extLst>
+                          </a:blip>
+                          <a:srcRect/>
+                          <a:stretch>
+                            <a:fillRect/>
+                          </a:stretch>
+                        </pic:blipFill>
+                        <pic:spPr bwMode="auto">
+                          <a:xfrm>
+                            <a:off x="0" y="0"/>
+                            <a:ext cx="2892229" cy="1566598"/>
+                          </a:xfrm>
+                          <a:prstGeom prst="rect">
+                            <a:avLst/>
+                          </a:prstGeom>
+                          <a:noFill/>
+                          <a:ln>
+                            <a:noFill/>
+                          </a:ln>
+                        </pic:spPr>
+                      </pic:pic>
+                    </a:graphicData>
+                  </a:graphic>
+                </wp:inline>
+              </w:drawing>
+            </w:r>
+          </w:p>
           <w:p/>
           <w:p/>
         </w:tc>
@@ -3565,7 +3620,7 @@
                           </pic:cNvPicPr>
                         </pic:nvPicPr>
                         <pic:blipFill>
-                          <a:blip r:embed="rId23" cstate="print">
+                          <a:blip r:embed="rId24" cstate="print">
                             <a:extLst>
                               <a:ext uri="{28A0092B-C50C-407E-A947-70E740481C1C}">
                                 <a14:useLocalDpi xmlns:a14="http://schemas.microsoft.com/office/drawing/2010/main" val="0"/>
@@ -3630,7 +3685,71 @@
           <w:tcPr>
             <w:tcW w:w="5242" w:type="dxa"/>
           </w:tcPr>
+          <w:p>
+            <w:pPr>
+              <w:pStyle w:val="ListParagraph"/>
+              <w:numPr>
+                <w:ilvl w:val="0"/>
+                <w:numId w:val="4"/>
+              </w:numPr>
+            </w:pPr>
+            <w:r>
+              <w:t>Scaling is too large – sizes will be uncomfortable</w:t>
+            </w:r>
+          </w:p>
+          <w:p>
+            <w:pPr>
+              <w:pStyle w:val="ListParagraph"/>
+              <w:numPr>
+                <w:ilvl w:val="0"/>
+                <w:numId w:val="4"/>
+              </w:numPr>
+            </w:pPr>
+            <w:r>
+              <w:t xml:space="preserve">Forearm </w:t>
+            </w:r>
+            <w:r>
+              <w:t>pad is not long enough and should lab around front-underside of elbow</w:t>
+            </w:r>
+          </w:p>
+        </w:tc>
+        <w:tc>
+          <w:tcPr>
+            <w:tcW w:w="2645" w:type="dxa"/>
+          </w:tcPr>
           <w:p/>
+        </w:tc>
+      </w:tr>
+      <w:tr>
+        <w:tc>
+          <w:tcPr>
+            <w:tcW w:w="1129" w:type="dxa"/>
+          </w:tcPr>
+          <w:p>
+            <w:pPr>
+              <w:rPr>
+                <w:b/>
+                <w:bCs/>
+              </w:rPr>
+            </w:pPr>
+            <w:r>
+              <w:rPr>
+                <w:b/>
+                <w:bCs/>
+              </w:rPr>
+              <w:t>Commit Version</w:t>
+            </w:r>
+          </w:p>
+        </w:tc>
+        <w:tc>
+          <w:tcPr>
+            <w:tcW w:w="5242" w:type="dxa"/>
+          </w:tcPr>
+          <w:p>
+            <w:pPr>
+              <w:pStyle w:val="ListParagraph"/>
+            </w:pPr>
+          </w:p>
         </w:tc>
         <w:tc>
           <w:tcPr>
@@ -4016,6 +4135,95 @@
       </w:pPr>
     </w:lvl>
   </w:abstractNum>
+  <w:abstractNum w:abstractNumId="3" w15:restartNumberingAfterBreak="0">
+    <w:nsid w:val="6E522023"/>
+    <w:multiLevelType w:val="hybridMultilevel"/>
+    <w:tmpl w:val="BB22A810"/>
+    <w:lvl w:ilvl="0" w:tplc="0809000F">
+      <w:start w:val="1"/>
+      <w:numFmt w:val="decimal"/>
+      <w:lvlText w:val="%1."/>
+      <w:lvlJc w:val="left"/>
+      <w:pPr>
+        <w:ind w:left="720" w:hanging="360"/>
+      </w:pPr>
+      <w:rPr>
+        <w:rFonts w:hint="default"/>
+      </w:rPr>
+    </w:lvl>
+    <w:lvl w:ilvl="1" w:tplc="08090019" w:tentative="1">
+      <w:start w:val="1"/>
+      <w:numFmt w:val="lowerLetter"/>
+      <w:lvlText w:val="%2."/>
+      <w:lvlJc w:val="left"/>
+      <w:pPr>
+        <w:ind w:left="1440" w:hanging="360"/>
+      </w:pPr>
+    </w:lvl>
+    <w:lvl w:ilvl="2" w:tplc="0809001B" w:tentative="1">
+      <w:start w:val="1"/>
+      <w:numFmt w:val="lowerRoman"/>
+      <w:lvlText w:val="%3."/>
+      <w:lvlJc w:val="right"/>
+      <w:pPr>
+        <w:ind w:left="2160" w:hanging="180"/>
+      </w:pPr>
+    </w:lvl>
+    <w:lvl w:ilvl="3" w:tplc="0809000F" w:tentative="1">
+      <w:start w:val="1"/>
+      <w:numFmt w:val="decimal"/>
+      <w:lvlText w:val="%4."/>
+      <w:lvlJc w:val="left"/>
+      <w:pPr>
+        <w:ind w:left="2880" w:hanging="360"/>
+      </w:pPr>
+    </w:lvl>
+    <w:lvl w:ilvl="4" w:tplc="08090019" w:tentative="1">
+      <w:start w:val="1"/>
+      <w:numFmt w:val="lowerLetter"/>
+      <w:lvlText w:val="%5."/>
+      <w:lvlJc w:val="left"/>
+      <w:pPr>
+        <w:ind w:left="3600" w:hanging="360"/>
+      </w:pPr>
+    </w:lvl>
+    <w:lvl w:ilvl="5" w:tplc="0809001B" w:tentative="1">
+      <w:start w:val="1"/>
+      <w:numFmt w:val="lowerRoman"/>
+      <w:lvlText w:val="%6."/>
+      <w:lvlJc w:val="right"/>
+      <w:pPr>
+        <w:ind w:left="4320" w:hanging="180"/>
+      </w:pPr>
+    </w:lvl>
+    <w:lvl w:ilvl="6" w:tplc="0809000F" w:tentative="1">
+      <w:start w:val="1"/>
+      <w:numFmt w:val="decimal"/>
+      <w:lvlText w:val="%7."/>
+      <w:lvlJc w:val="left"/>
+      <w:pPr>
+        <w:ind w:left="5040" w:hanging="360"/>
+      </w:pPr>
+    </w:lvl>
+    <w:lvl w:ilvl="7" w:tplc="08090019" w:tentative="1">
+      <w:start w:val="1"/>
+      <w:numFmt w:val="lowerLetter"/>
+      <w:lvlText w:val="%8."/>
+      <w:lvlJc w:val="left"/>
+      <w:pPr>
+        <w:ind w:left="5760" w:hanging="360"/>
+      </w:pPr>
+    </w:lvl>
+    <w:lvl w:ilvl="8" w:tplc="0809001B" w:tentative="1">
+      <w:start w:val="1"/>
+      <w:numFmt w:val="lowerRoman"/>
+      <w:lvlText w:val="%9."/>
+      <w:lvlJc w:val="right"/>
+      <w:pPr>
+        <w:ind w:left="6480" w:hanging="180"/>
+      </w:pPr>
+    </w:lvl>
+  </w:abstractNum>
   <w:num w:numId="1" w16cid:durableId="917180164">
     <w:abstractNumId w:val="2"/>
   </w:num>
@@ -4024,6 +4232,9 @@
   </w:num>
   <w:num w:numId="3" w16cid:durableId="116147903">
     <w:abstractNumId w:val="1"/>
+  </w:num>
+  <w:num w:numId="4" w16cid:durableId="1092701774">
+    <w:abstractNumId w:val="3"/>
   </w:num>
 </w:numbering>
 </file>

</xml_diff>

<commit_message>
Iteration 2: forearm pad from the measured paper template, bicep rescaled
The forearm outline is now digitised from the paper template wrapped round
the wearer's forearm (FOREARM_TEMPLATE_MM, scaled by the ruler in the photo):
240 mm round the arm at the elbow end, 210 mm long, narrowing to the 50 mm
underside strap at the wrist, tails on the elbow-end edge. The bicep pad is
scaled to the same arm (180 mm long, 200 -> 175 mm wide); the chest halves
are unchanged. Boards carry "iter2" in their title block and summary.json,
and all Gerbers, footprints, previews and checks are regenerated.

Also adds the template photos and the updated documentation docx.

Co-Authored-By: Claude Fable 5.1 <noreply@anthropic.com>
</commit_message>
<xml_diff>
--- a/Body-Pad Pressure Flex PCB documentation.docx
+++ b/Body-Pad Pressure Flex PCB documentation.docx
@@ -3746,9 +3746,9 @@
             <w:tcW w:w="5242" w:type="dxa"/>
           </w:tcPr>
           <w:p>
-            <w:pPr>
-              <w:pStyle w:val="ListParagraph"/>
-            </w:pPr>
+            <w:r>
+              <w:t>cc466401fcc1b17eab31f7705b4fdf478802aa64</w:t>
+            </w:r>
           </w:p>
         </w:tc>
         <w:tc>

</xml_diff>